<commit_message>
docs: update PRIMER.md (filesystem MCP note, dash fix) and docx inventory
Co-Authored-By: Claude Sonnet 4.6 <noreply@anthropic.com>
</commit_message>
<xml_diff>
--- a/docs/ChronoBloom_Compact_Function_Inventory.docx
+++ b/docs/ChronoBloom_Compact_Function_Inventory.docx
@@ -588,6 +588,7 @@
             <w:pPr>
               <w:spacing w:after="0" w:line="240" w:lineRule="auto"/>
             </w:pPr>
+            <w:bookmarkStart w:id="0" w:name="OLE_LINK1"/>
             <w:r>
               <w:rPr>
                 <w:b/>
@@ -595,6 +596,7 @@
               </w:rPr>
               <w:t>ClockRenderer::renderFace</w:t>
             </w:r>
+            <w:bookmarkEnd w:id="0"/>
           </w:p>
         </w:tc>
         <w:tc>
@@ -2244,6 +2246,7 @@
             <w:pPr>
               <w:spacing w:after="0" w:line="240" w:lineRule="auto"/>
             </w:pPr>
+            <w:bookmarkStart w:id="1" w:name="OLE_LINK2"/>
             <w:r>
               <w:rPr>
                 <w:b/>
@@ -2251,6 +2254,7 @@
               </w:rPr>
               <w:t>WebUi::htmlPage</w:t>
             </w:r>
+            <w:bookmarkEnd w:id="1"/>
           </w:p>
         </w:tc>
         <w:tc>

</xml_diff>